<commit_message>
Add selectable ineligible report worklist
</commit_message>
<xml_diff>
--- a/outputs/ineligible-guide/GMCL_Ineligible_Player_Quick_Guide.docx
+++ b/outputs/ineligible-guide/GMCL_Ineligible_Player_Quick_Guide.docx
@@ -261,7 +261,7 @@
                 <w:color w:val="20252B"/>
                 <w:sz w:val="22"/>
               </w:rPr>
-              <w:t>Importing is not the same as raising a case. Google Form imports create reports for review. The tracker applies historical information only. Staff deliberately raise every live case.</w:t>
+              <w:t>Importing is not the same as raising a case. The Google Form import brings reports in for staff to choose and review. The tracker applies historical information only. Staff deliberately raise every live case.</w:t>
             </w:r>
           </w:p>
         </w:tc>
@@ -606,7 +606,7 @@
                 <w:color w:val="20252B"/>
                 <w:sz w:val="20"/>
               </w:rPr>
-              <w:t>Bring in several Google Form responses</w:t>
+              <w:t>Import reports and choose which to progress</w:t>
             </w:r>
           </w:p>
         </w:tc>
@@ -640,7 +640,7 @@
                 <w:color w:val="20252B"/>
                 <w:sz w:val="20"/>
               </w:rPr>
-              <w:t>Route 2 - Import Google Form reports</w:t>
+              <w:t>Route 2 - Import and choose reports</w:t>
             </w:r>
           </w:p>
         </w:tc>
@@ -922,7 +922,7 @@
           <w:color w:val="20252B"/>
           <w:sz w:val="22"/>
         </w:rPr>
-        <w:t>Open next report</w:t>
+        <w:t>Open next selected report</w:t>
       </w:r>
       <w:r>
         <w:rPr>
@@ -1356,12 +1356,79 @@
       </w:r>
     </w:p>
     <w:p>
+      <w:r>
+        <w:br w:type="page"/>
+      </w:r>
+    </w:p>
+    <w:p>
       <w:pPr>
         <w:pStyle w:val="Heading1"/>
       </w:pPr>
       <w:r>
-        <w:t>Route 2 - Import Google Form reports</w:t>
+        <w:t>Route 2 - Import and choose reports</w:t>
       </w:r>
+    </w:p>
+    <w:tbl>
+      <w:tblPr>
+        <w:tblW w:type="dxa" w:w="9360"/>
+        <w:jc w:val="left"/>
+        <w:tblLayout w:type="fixed"/>
+        <w:tblLook w:firstColumn="1" w:firstRow="1" w:lastColumn="0" w:lastRow="0" w:noHBand="0" w:noVBand="1" w:val="04A0"/>
+        <w:tblInd w:w="120" w:type="dxa"/>
+      </w:tblPr>
+      <w:tblGrid>
+        <w:gridCol w:w="9360"/>
+      </w:tblGrid>
+      <w:tr>
+        <w:tc>
+          <w:tcPr>
+            <w:tcW w:type="dxa" w:w="9360"/>
+            <w:tcMar>
+              <w:top w:w="80" w:type="dxa"/>
+              <w:start w:w="120" w:type="dxa"/>
+              <w:bottom w:w="80" w:type="dxa"/>
+              <w:end w:w="120" w:type="dxa"/>
+            </w:tcMar>
+            <w:vAlign w:val="center"/>
+            <w:shd w:fill="FFF4D6"/>
+            <w:tcBorders>
+              <w:left w:val="single" w:sz="18" w:color="A66B00"/>
+            </w:tcBorders>
+          </w:tcPr>
+          <w:p>
+            <w:pPr>
+              <w:keepNext w:val="0"/>
+              <w:spacing w:before="0" w:after="0" w:line="300" w:lineRule="auto"/>
+            </w:pPr>
+            <w:r>
+              <w:rPr>
+                <w:rFonts w:ascii="Calibri" w:hAnsi="Calibri"/>
+                <w:b/>
+                <w:i w:val="0"/>
+                <w:color w:val="A66B00"/>
+                <w:sz w:val="18"/>
+              </w:rPr>
+              <w:t xml:space="preserve">VALUES, NOT COLOURS  </w:t>
+            </w:r>
+            <w:r>
+              <w:rPr>
+                <w:rFonts w:ascii="Calibri" w:hAnsi="Calibri"/>
+                <w:b w:val="0"/>
+                <w:i w:val="0"/>
+                <w:color w:val="20252B"/>
+                <w:sz w:val="22"/>
+              </w:rPr>
+              <w:t>The system cannot see blue cell formatting. Import the full configured response sheet, then tick the exact reports to progress. Do not delete or reorder rows in the live response sheet.</w:t>
+            </w:r>
+          </w:p>
+        </w:tc>
+      </w:tr>
+    </w:tbl>
+    <w:p>
+      <w:pPr>
+        <w:keepNext w:val="0"/>
+        <w:spacing w:before="0" w:after="0" w:line="240" w:lineRule="auto"/>
+      </w:pPr>
     </w:p>
     <w:p>
       <w:pPr>
@@ -1380,7 +1447,7 @@
           <w:color w:val="20252B"/>
           <w:sz w:val="22"/>
         </w:rPr>
-        <w:t>Make sure the required reports have been completed in the private Google Form.</w:t>
+        <w:t>Make sure the reports are present in the private Google Form response sheet.</w:t>
       </w:r>
     </w:p>
     <w:p>
@@ -1470,7 +1537,7 @@
           <w:color w:val="20252B"/>
           <w:sz w:val="22"/>
         </w:rPr>
-        <w:t>Import Google Form reports</w:t>
+        <w:t>Import and choose reports</w:t>
       </w:r>
       <w:r>
         <w:rPr>
@@ -1520,6 +1587,166 @@
           <w:color w:val="20252B"/>
           <w:sz w:val="22"/>
         </w:rPr>
+        <w:t xml:space="preserve">On Choose the reports to progress, tick </w:t>
+      </w:r>
+      <w:r>
+        <w:rPr>
+          <w:rFonts w:ascii="Calibri" w:hAnsi="Calibri"/>
+          <w:b/>
+          <w:i w:val="0"/>
+          <w:color w:val="20252B"/>
+          <w:sz w:val="22"/>
+        </w:rPr>
+        <w:t>Progress</w:t>
+      </w:r>
+      <w:r>
+        <w:rPr>
+          <w:rFonts w:ascii="Calibri" w:hAnsi="Calibri"/>
+          <w:b w:val="0"/>
+          <w:i w:val="0"/>
+          <w:color w:val="20252B"/>
+          <w:sz w:val="22"/>
+        </w:rPr>
+        <w:t xml:space="preserve"> beside every required report.</w:t>
+      </w:r>
+    </w:p>
+    <w:p>
+      <w:pPr>
+        <w:keepNext w:val="0"/>
+        <w:spacing w:before="0" w:after="80" w:line="300" w:lineRule="auto"/>
+        <w:numPr>
+          <w:ilvl w:val="0"/>
+          <w:numId w:val="204"/>
+        </w:numPr>
+      </w:pPr>
+      <w:r>
+        <w:rPr>
+          <w:rFonts w:ascii="Calibri" w:hAnsi="Calibri"/>
+          <w:b w:val="0"/>
+          <w:i w:val="0"/>
+          <w:color w:val="20252B"/>
+          <w:sz w:val="22"/>
+        </w:rPr>
+        <w:t xml:space="preserve">Check the total. For the Rev 8 blue-row handover, it should show </w:t>
+      </w:r>
+      <w:r>
+        <w:rPr>
+          <w:rFonts w:ascii="Calibri" w:hAnsi="Calibri"/>
+          <w:b/>
+          <w:i w:val="0"/>
+          <w:color w:val="20252B"/>
+          <w:sz w:val="22"/>
+        </w:rPr>
+        <w:t>18 selected</w:t>
+      </w:r>
+      <w:r>
+        <w:rPr>
+          <w:rFonts w:ascii="Calibri" w:hAnsi="Calibri"/>
+          <w:b w:val="0"/>
+          <w:i w:val="0"/>
+          <w:color w:val="20252B"/>
+          <w:sz w:val="22"/>
+        </w:rPr>
+        <w:t>.</w:t>
+      </w:r>
+    </w:p>
+    <w:p>
+      <w:pPr>
+        <w:keepNext w:val="0"/>
+        <w:spacing w:before="0" w:after="80" w:line="300" w:lineRule="auto"/>
+        <w:numPr>
+          <w:ilvl w:val="0"/>
+          <w:numId w:val="204"/>
+        </w:numPr>
+      </w:pPr>
+      <w:r>
+        <w:rPr>
+          <w:rFonts w:ascii="Calibri" w:hAnsi="Calibri"/>
+          <w:b w:val="0"/>
+          <w:i w:val="0"/>
+          <w:color w:val="20252B"/>
+          <w:sz w:val="22"/>
+        </w:rPr>
+        <w:t xml:space="preserve">Enter a short reason such as </w:t>
+      </w:r>
+      <w:r>
+        <w:rPr>
+          <w:rFonts w:ascii="Calibri" w:hAnsi="Calibri"/>
+          <w:b/>
+          <w:i w:val="0"/>
+          <w:color w:val="20252B"/>
+          <w:sz w:val="22"/>
+        </w:rPr>
+        <w:t>Rev 8 blue rows</w:t>
+      </w:r>
+      <w:r>
+        <w:rPr>
+          <w:rFonts w:ascii="Calibri" w:hAnsi="Calibri"/>
+          <w:b w:val="0"/>
+          <w:i w:val="0"/>
+          <w:color w:val="20252B"/>
+          <w:sz w:val="22"/>
+        </w:rPr>
+        <w:t>.</w:t>
+      </w:r>
+    </w:p>
+    <w:p>
+      <w:pPr>
+        <w:keepNext w:val="0"/>
+        <w:spacing w:before="0" w:after="80" w:line="300" w:lineRule="auto"/>
+        <w:numPr>
+          <w:ilvl w:val="0"/>
+          <w:numId w:val="204"/>
+        </w:numPr>
+      </w:pPr>
+      <w:r>
+        <w:rPr>
+          <w:rFonts w:ascii="Calibri" w:hAnsi="Calibri"/>
+          <w:b w:val="0"/>
+          <w:i w:val="0"/>
+          <w:color w:val="20252B"/>
+          <w:sz w:val="22"/>
+        </w:rPr>
+        <w:t xml:space="preserve">Click </w:t>
+      </w:r>
+      <w:r>
+        <w:rPr>
+          <w:rFonts w:ascii="Calibri" w:hAnsi="Calibri"/>
+          <w:b/>
+          <w:i w:val="0"/>
+          <w:color w:val="20252B"/>
+          <w:sz w:val="22"/>
+        </w:rPr>
+        <w:t>Save selection and show work queue</w:t>
+      </w:r>
+      <w:r>
+        <w:rPr>
+          <w:rFonts w:ascii="Calibri" w:hAnsi="Calibri"/>
+          <w:b w:val="0"/>
+          <w:i w:val="0"/>
+          <w:color w:val="20252B"/>
+          <w:sz w:val="22"/>
+        </w:rPr>
+        <w:t>.</w:t>
+      </w:r>
+    </w:p>
+    <w:p>
+      <w:pPr>
+        <w:keepNext w:val="0"/>
+        <w:spacing w:before="0" w:after="80" w:line="300" w:lineRule="auto"/>
+        <w:numPr>
+          <w:ilvl w:val="0"/>
+          <w:numId w:val="204"/>
+        </w:numPr>
+      </w:pPr>
+      <w:r>
+        <w:rPr>
+          <w:rFonts w:ascii="Calibri" w:hAnsi="Calibri"/>
+          <w:b w:val="0"/>
+          <w:i w:val="0"/>
+          <w:color w:val="20252B"/>
+          <w:sz w:val="22"/>
+        </w:rPr>
         <w:t xml:space="preserve">Click </w:t>
       </w:r>
       <w:r>
@@ -1540,7 +1767,7 @@
           <w:color w:val="20252B"/>
           <w:sz w:val="22"/>
         </w:rPr>
-        <w:t xml:space="preserve"> beside the first imported report.</w:t>
+        <w:t xml:space="preserve"> beside the first selected report.</w:t>
       </w:r>
     </w:p>
     <w:p>
@@ -1585,6 +1812,68 @@
               <w:end w:w="120" w:type="dxa"/>
             </w:tcMar>
             <w:vAlign w:val="center"/>
+            <w:shd w:fill="E9F5EC"/>
+            <w:tcBorders>
+              <w:left w:val="single" w:sz="18" w:color="397A45"/>
+            </w:tcBorders>
+          </w:tcPr>
+          <w:p>
+            <w:pPr>
+              <w:keepNext w:val="0"/>
+              <w:spacing w:before="0" w:after="0" w:line="300" w:lineRule="auto"/>
+            </w:pPr>
+            <w:r>
+              <w:rPr>
+                <w:rFonts w:ascii="Calibri" w:hAnsi="Calibri"/>
+                <w:b/>
+                <w:i w:val="0"/>
+                <w:color w:val="397A45"/>
+                <w:sz w:val="18"/>
+              </w:rPr>
+              <w:t xml:space="preserve">EXPECTED RESULT  </w:t>
+            </w:r>
+            <w:r>
+              <w:rPr>
+                <w:rFonts w:ascii="Calibri" w:hAnsi="Calibri"/>
+                <w:b w:val="0"/>
+                <w:i w:val="0"/>
+                <w:color w:val="20252B"/>
+                <w:sz w:val="22"/>
+              </w:rPr>
+              <w:t>Selected reports appear in the normal queue. Unselected reports are hidden, not deleted, and remain available under View hidden reports or All imported.</w:t>
+            </w:r>
+          </w:p>
+        </w:tc>
+      </w:tr>
+    </w:tbl>
+    <w:p>
+      <w:pPr>
+        <w:keepNext w:val="0"/>
+        <w:spacing w:before="0" w:after="0" w:line="240" w:lineRule="auto"/>
+      </w:pPr>
+    </w:p>
+    <w:tbl>
+      <w:tblPr>
+        <w:tblW w:type="dxa" w:w="9360"/>
+        <w:jc w:val="left"/>
+        <w:tblLayout w:type="fixed"/>
+        <w:tblLook w:firstColumn="1" w:firstRow="1" w:lastColumn="0" w:lastRow="0" w:noHBand="0" w:noVBand="1" w:val="04A0"/>
+        <w:tblInd w:w="120" w:type="dxa"/>
+      </w:tblPr>
+      <w:tblGrid>
+        <w:gridCol w:w="9360"/>
+      </w:tblGrid>
+      <w:tr>
+        <w:tc>
+          <w:tcPr>
+            <w:tcW w:type="dxa" w:w="9360"/>
+            <w:tcMar>
+              <w:top w:w="80" w:type="dxa"/>
+              <w:start w:w="120" w:type="dxa"/>
+              <w:bottom w:w="80" w:type="dxa"/>
+              <w:end w:w="120" w:type="dxa"/>
+            </w:tcMar>
+            <w:vAlign w:val="center"/>
             <w:shd w:fill="E8EEF5"/>
             <w:tcBorders>
               <w:left w:val="single" w:sz="18" w:color="2E74B5"/>
@@ -1603,7 +1892,7 @@
                 <w:color w:val="2E74B5"/>
                 <w:sz w:val="18"/>
               </w:rPr>
-              <w:t xml:space="preserve">EXPECTED RESULT  </w:t>
+              <w:t xml:space="preserve">NEW SUBMISSIONS  </w:t>
             </w:r>
             <w:r>
               <w:rPr>
@@ -1613,7 +1902,7 @@
                 <w:color w:val="20252B"/>
                 <w:sz w:val="22"/>
               </w:rPr>
-              <w:t>Several reports enter the queue together, but staff still raise, link or resolve each report individually.</w:t>
+              <w:t>A report received after selection stays visible as New - not yet chosen until the next selection.</w:t>
             </w:r>
           </w:p>
         </w:tc>
@@ -2877,6 +3166,751 @@
         <w:t>Outcomes are not sent until Issue approved outcomes is selected.</w:t>
       </w:r>
     </w:p>
+    <w:p>
+      <w:r>
+        <w:br w:type="page"/>
+      </w:r>
+    </w:p>
+    <w:p>
+      <w:pPr>
+        <w:pStyle w:val="Heading1"/>
+      </w:pPr>
+      <w:r>
+        <w:t>Board flow - controlled intake to outcome</w:t>
+      </w:r>
+    </w:p>
+    <w:p>
+      <w:pPr>
+        <w:keepNext w:val="0"/>
+        <w:spacing w:before="0" w:after="120" w:line="300" w:lineRule="auto"/>
+      </w:pPr>
+      <w:r>
+        <w:rPr>
+          <w:rFonts w:ascii="Calibri" w:hAnsi="Calibri"/>
+          <w:b w:val="0"/>
+          <w:i w:val="0"/>
+          <w:color w:val="20252B"/>
+          <w:sz w:val="22"/>
+        </w:rPr>
+        <w:t>The control is deliberate at every stage: import everything, select the active workload, review one report at a time and require independent approval before any outcome.</w:t>
+      </w:r>
+    </w:p>
+    <w:tbl>
+      <w:tblPr>
+        <w:tblW w:type="dxa" w:w="9360"/>
+        <w:jc w:val="left"/>
+        <w:tblLayout w:type="fixed"/>
+        <w:tblLook w:firstColumn="1" w:firstRow="1" w:lastColumn="0" w:lastRow="0" w:noHBand="0" w:noVBand="1" w:val="04A0"/>
+        <w:tblInd w:w="120" w:type="dxa"/>
+      </w:tblPr>
+      <w:tblGrid>
+        <w:gridCol w:w="9360"/>
+      </w:tblGrid>
+      <w:tr>
+        <w:tc>
+          <w:tcPr>
+            <w:tcW w:type="dxa" w:w="9360"/>
+            <w:tcMar>
+              <w:top w:w="80" w:type="dxa"/>
+              <w:start w:w="120" w:type="dxa"/>
+              <w:bottom w:w="80" w:type="dxa"/>
+              <w:end w:w="120" w:type="dxa"/>
+            </w:tcMar>
+            <w:vAlign w:val="center"/>
+            <w:shd w:fill="E8EEF5"/>
+            <w:tcBorders>
+              <w:left w:val="single" w:sz="18" w:color="2E74B5"/>
+            </w:tcBorders>
+          </w:tcPr>
+          <w:p>
+            <w:pPr>
+              <w:keepNext w:val="0"/>
+              <w:spacing w:before="0" w:after="0" w:line="300" w:lineRule="auto"/>
+            </w:pPr>
+            <w:r>
+              <w:rPr>
+                <w:rFonts w:ascii="Calibri" w:hAnsi="Calibri"/>
+                <w:b/>
+                <w:i w:val="0"/>
+                <w:color w:val="2E74B5"/>
+                <w:sz w:val="18"/>
+              </w:rPr>
+              <w:t xml:space="preserve">1  SAFE IMPORT  </w:t>
+            </w:r>
+            <w:r>
+              <w:rPr>
+                <w:rFonts w:ascii="Calibri" w:hAnsi="Calibri"/>
+                <w:b w:val="0"/>
+                <w:i w:val="0"/>
+                <w:color w:val="20252B"/>
+                <w:sz w:val="22"/>
+              </w:rPr>
+              <w:t>All configured Google Form responses are imported into the private intake area. Nothing is deleted and no case or email is created.</w:t>
+            </w:r>
+          </w:p>
+        </w:tc>
+      </w:tr>
+    </w:tbl>
+    <w:p>
+      <w:pPr>
+        <w:keepNext w:val="0"/>
+        <w:spacing w:before="0" w:after="0" w:line="240" w:lineRule="auto"/>
+      </w:pPr>
+    </w:p>
+    <w:p>
+      <w:pPr>
+        <w:keepNext w:val="0"/>
+        <w:spacing w:before="0" w:after="40" w:line="240" w:lineRule="auto"/>
+        <w:jc w:val="center"/>
+      </w:pPr>
+      <w:r>
+        <w:rPr>
+          <w:rFonts w:ascii="Calibri" w:hAnsi="Calibri"/>
+          <w:b/>
+          <w:i w:val="0"/>
+          <w:color w:val="2E74B5"/>
+          <w:sz w:val="32"/>
+        </w:rPr>
+        <w:t>↓</w:t>
+      </w:r>
+    </w:p>
+    <w:tbl>
+      <w:tblPr>
+        <w:tblW w:type="dxa" w:w="9360"/>
+        <w:jc w:val="left"/>
+        <w:tblLayout w:type="fixed"/>
+        <w:tblLook w:firstColumn="1" w:firstRow="1" w:lastColumn="0" w:lastRow="0" w:noHBand="0" w:noVBand="1" w:val="04A0"/>
+        <w:tblInd w:w="120" w:type="dxa"/>
+      </w:tblPr>
+      <w:tblGrid>
+        <w:gridCol w:w="9360"/>
+      </w:tblGrid>
+      <w:tr>
+        <w:tc>
+          <w:tcPr>
+            <w:tcW w:type="dxa" w:w="9360"/>
+            <w:tcMar>
+              <w:top w:w="80" w:type="dxa"/>
+              <w:start w:w="120" w:type="dxa"/>
+              <w:bottom w:w="80" w:type="dxa"/>
+              <w:end w:w="120" w:type="dxa"/>
+            </w:tcMar>
+            <w:vAlign w:val="center"/>
+            <w:shd w:fill="E8EEF5"/>
+            <w:tcBorders>
+              <w:left w:val="single" w:sz="18" w:color="2E74B5"/>
+            </w:tcBorders>
+          </w:tcPr>
+          <w:p>
+            <w:pPr>
+              <w:keepNext w:val="0"/>
+              <w:spacing w:before="0" w:after="0" w:line="300" w:lineRule="auto"/>
+            </w:pPr>
+            <w:r>
+              <w:rPr>
+                <w:rFonts w:ascii="Calibri" w:hAnsi="Calibri"/>
+                <w:b/>
+                <w:i w:val="0"/>
+                <w:color w:val="2E74B5"/>
+                <w:sz w:val="18"/>
+              </w:rPr>
+              <w:t xml:space="preserve">2  STAFF SELECTION  </w:t>
+            </w:r>
+            <w:r>
+              <w:rPr>
+                <w:rFonts w:ascii="Calibri" w:hAnsi="Calibri"/>
+                <w:b w:val="0"/>
+                <w:i w:val="0"/>
+                <w:color w:val="20252B"/>
+                <w:sz w:val="22"/>
+              </w:rPr>
+              <w:t>Staff tick the exact reports to progress and save the work list.</w:t>
+            </w:r>
+          </w:p>
+        </w:tc>
+      </w:tr>
+    </w:tbl>
+    <w:p>
+      <w:pPr>
+        <w:keepNext w:val="0"/>
+        <w:spacing w:before="0" w:after="0" w:line="240" w:lineRule="auto"/>
+      </w:pPr>
+    </w:p>
+    <w:p>
+      <w:pPr>
+        <w:keepNext w:val="0"/>
+        <w:spacing w:before="0" w:after="40" w:line="240" w:lineRule="auto"/>
+        <w:jc w:val="center"/>
+      </w:pPr>
+      <w:r>
+        <w:rPr>
+          <w:rFonts w:ascii="Calibri" w:hAnsi="Calibri"/>
+          <w:b/>
+          <w:i w:val="0"/>
+          <w:color w:val="2E74B5"/>
+          <w:sz w:val="32"/>
+        </w:rPr>
+        <w:t>↓</w:t>
+      </w:r>
+    </w:p>
+    <w:tbl>
+      <w:tblPr>
+        <w:tblW w:type="dxa" w:w="9360"/>
+        <w:tblLayout w:type="fixed"/>
+        <w:tblLook w:firstColumn="1" w:firstRow="1" w:lastColumn="0" w:lastRow="0" w:noHBand="0" w:noVBand="1" w:val="04A0"/>
+        <w:jc w:val="left"/>
+        <w:tblInd w:w="120" w:type="dxa"/>
+      </w:tblPr>
+      <w:tblGrid>
+        <w:gridCol w:w="4680"/>
+        <w:gridCol w:w="4680"/>
+      </w:tblGrid>
+      <w:tr>
+        <w:tc>
+          <w:tcPr>
+            <w:tcW w:type="dxa" w:w="4680"/>
+            <w:tcMar>
+              <w:top w:w="80" w:type="dxa"/>
+              <w:start w:w="120" w:type="dxa"/>
+              <w:bottom w:w="80" w:type="dxa"/>
+              <w:end w:w="120" w:type="dxa"/>
+            </w:tcMar>
+            <w:vAlign w:val="center"/>
+            <w:shd w:fill="E8EEF5"/>
+            <w:tcBorders>
+              <w:top w:val="single" w:sz="6" w:color="D7DBE2"/>
+              <w:left w:val="single" w:sz="6" w:color="D7DBE2"/>
+              <w:bottom w:val="single" w:sz="6" w:color="D7DBE2"/>
+              <w:right w:val="single" w:sz="6" w:color="D7DBE2"/>
+            </w:tcBorders>
+          </w:tcPr>
+          <w:p>
+            <w:pPr>
+              <w:keepNext w:val="0"/>
+              <w:spacing w:before="0" w:after="0" w:line="240" w:lineRule="auto"/>
+            </w:pPr>
+            <w:r>
+              <w:rPr>
+                <w:rFonts w:ascii="Calibri" w:hAnsi="Calibri"/>
+                <w:b/>
+                <w:i w:val="0"/>
+                <w:color w:val="1F4D78"/>
+                <w:sz w:val="20"/>
+              </w:rPr>
+              <w:t>SELECTED</w:t>
+            </w:r>
+          </w:p>
+        </w:tc>
+        <w:tc>
+          <w:tcPr>
+            <w:tcW w:type="dxa" w:w="4680"/>
+            <w:tcMar>
+              <w:top w:w="80" w:type="dxa"/>
+              <w:start w:w="120" w:type="dxa"/>
+              <w:bottom w:w="80" w:type="dxa"/>
+              <w:end w:w="120" w:type="dxa"/>
+            </w:tcMar>
+            <w:vAlign w:val="center"/>
+            <w:shd w:fill="E8EEF5"/>
+            <w:tcBorders>
+              <w:top w:val="single" w:sz="6" w:color="D7DBE2"/>
+              <w:left w:val="single" w:sz="6" w:color="D7DBE2"/>
+              <w:bottom w:val="single" w:sz="6" w:color="D7DBE2"/>
+              <w:right w:val="single" w:sz="6" w:color="D7DBE2"/>
+            </w:tcBorders>
+          </w:tcPr>
+          <w:p>
+            <w:pPr>
+              <w:keepNext w:val="0"/>
+              <w:spacing w:before="0" w:after="0" w:line="240" w:lineRule="auto"/>
+            </w:pPr>
+            <w:r>
+              <w:rPr>
+                <w:rFonts w:ascii="Calibri" w:hAnsi="Calibri"/>
+                <w:b/>
+                <w:i w:val="0"/>
+                <w:color w:val="1F4D78"/>
+                <w:sz w:val="20"/>
+              </w:rPr>
+              <w:t>NOT SELECTED</w:t>
+            </w:r>
+          </w:p>
+        </w:tc>
+      </w:tr>
+      <w:tr>
+        <w:tc>
+          <w:tcPr>
+            <w:tcW w:type="dxa" w:w="4680"/>
+            <w:tcBorders>
+              <w:top w:val="single" w:sz="6" w:color="D7DBE2"/>
+              <w:left w:val="single" w:sz="6" w:color="D7DBE2"/>
+              <w:bottom w:val="single" w:sz="6" w:color="D7DBE2"/>
+              <w:right w:val="single" w:sz="6" w:color="D7DBE2"/>
+            </w:tcBorders>
+            <w:tcMar>
+              <w:top w:w="80" w:type="dxa"/>
+              <w:start w:w="120" w:type="dxa"/>
+              <w:bottom w:w="80" w:type="dxa"/>
+              <w:end w:w="120" w:type="dxa"/>
+            </w:tcMar>
+            <w:vAlign w:val="center"/>
+          </w:tcPr>
+          <w:p>
+            <w:pPr>
+              <w:keepNext w:val="0"/>
+              <w:spacing w:before="0" w:after="0" w:line="276" w:lineRule="auto"/>
+            </w:pPr>
+            <w:r>
+              <w:rPr>
+                <w:rFonts w:ascii="Calibri" w:hAnsi="Calibri"/>
+                <w:b w:val="0"/>
+                <w:i w:val="0"/>
+                <w:color w:val="20252B"/>
+                <w:sz w:val="20"/>
+              </w:rPr>
+              <w:t>Shown in the normal work queue</w:t>
+              <w:br/>
+              <w:t>Continues below for individual review</w:t>
+            </w:r>
+          </w:p>
+        </w:tc>
+        <w:tc>
+          <w:tcPr>
+            <w:tcW w:type="dxa" w:w="4680"/>
+            <w:tcBorders>
+              <w:top w:val="single" w:sz="6" w:color="D7DBE2"/>
+              <w:left w:val="single" w:sz="6" w:color="D7DBE2"/>
+              <w:bottom w:val="single" w:sz="6" w:color="D7DBE2"/>
+              <w:right w:val="single" w:sz="6" w:color="D7DBE2"/>
+            </w:tcBorders>
+            <w:tcMar>
+              <w:top w:w="80" w:type="dxa"/>
+              <w:start w:w="120" w:type="dxa"/>
+              <w:bottom w:w="80" w:type="dxa"/>
+              <w:end w:w="120" w:type="dxa"/>
+            </w:tcMar>
+            <w:vAlign w:val="center"/>
+          </w:tcPr>
+          <w:p>
+            <w:pPr>
+              <w:keepNext w:val="0"/>
+              <w:spacing w:before="0" w:after="0" w:line="276" w:lineRule="auto"/>
+            </w:pPr>
+            <w:r>
+              <w:rPr>
+                <w:rFonts w:ascii="Calibri" w:hAnsi="Calibri"/>
+                <w:b/>
+                <w:i w:val="0"/>
+                <w:color w:val="20252B"/>
+                <w:sz w:val="20"/>
+              </w:rPr>
+              <w:t>Hidden from the normal queue</w:t>
+              <w:br/>
+              <w:t>Stops here until deliberately reselected</w:t>
+            </w:r>
+          </w:p>
+        </w:tc>
+      </w:tr>
+    </w:tbl>
+    <w:p>
+      <w:pPr>
+        <w:keepNext w:val="0"/>
+        <w:spacing w:before="0" w:after="40" w:line="240" w:lineRule="auto"/>
+        <w:jc w:val="center"/>
+      </w:pPr>
+      <w:r>
+        <w:rPr>
+          <w:rFonts w:ascii="Calibri" w:hAnsi="Calibri"/>
+          <w:b/>
+          <w:i w:val="0"/>
+          <w:color w:val="2E74B5"/>
+          <w:sz w:val="32"/>
+        </w:rPr>
+        <w:t>↓</w:t>
+      </w:r>
+    </w:p>
+    <w:p>
+      <w:pPr>
+        <w:pStyle w:val="Heading2"/>
+      </w:pPr>
+      <w:r>
+        <w:t>Selected branch - one report at a time</w:t>
+      </w:r>
+    </w:p>
+    <w:tbl>
+      <w:tblPr>
+        <w:tblW w:type="dxa" w:w="9360"/>
+        <w:tblLayout w:type="fixed"/>
+        <w:tblLook w:firstColumn="1" w:firstRow="1" w:lastColumn="0" w:lastRow="0" w:noHBand="0" w:noVBand="1" w:val="04A0"/>
+        <w:jc w:val="left"/>
+        <w:tblInd w:w="120" w:type="dxa"/>
+      </w:tblPr>
+      <w:tblGrid>
+        <w:gridCol w:w="3120"/>
+        <w:gridCol w:w="3120"/>
+        <w:gridCol w:w="3120"/>
+      </w:tblGrid>
+      <w:tr>
+        <w:tc>
+          <w:tcPr>
+            <w:tcW w:type="dxa" w:w="3120"/>
+            <w:tcMar>
+              <w:top w:w="80" w:type="dxa"/>
+              <w:start w:w="120" w:type="dxa"/>
+              <w:bottom w:w="80" w:type="dxa"/>
+              <w:end w:w="120" w:type="dxa"/>
+            </w:tcMar>
+            <w:vAlign w:val="center"/>
+            <w:shd w:fill="E8EEF5"/>
+            <w:tcBorders>
+              <w:top w:val="single" w:sz="6" w:color="D7DBE2"/>
+              <w:left w:val="single" w:sz="6" w:color="D7DBE2"/>
+              <w:bottom w:val="single" w:sz="6" w:color="D7DBE2"/>
+              <w:right w:val="single" w:sz="6" w:color="D7DBE2"/>
+            </w:tcBorders>
+          </w:tcPr>
+          <w:p>
+            <w:pPr>
+              <w:keepNext w:val="0"/>
+              <w:spacing w:before="0" w:after="0" w:line="240" w:lineRule="auto"/>
+            </w:pPr>
+            <w:r>
+              <w:rPr>
+                <w:rFonts w:ascii="Calibri" w:hAnsi="Calibri"/>
+                <w:b/>
+                <w:i w:val="0"/>
+                <w:color w:val="1F4D78"/>
+                <w:sz w:val="20"/>
+              </w:rPr>
+              <w:t>NEW MATTER</w:t>
+            </w:r>
+          </w:p>
+        </w:tc>
+        <w:tc>
+          <w:tcPr>
+            <w:tcW w:type="dxa" w:w="3120"/>
+            <w:tcMar>
+              <w:top w:w="80" w:type="dxa"/>
+              <w:start w:w="120" w:type="dxa"/>
+              <w:bottom w:w="80" w:type="dxa"/>
+              <w:end w:w="120" w:type="dxa"/>
+            </w:tcMar>
+            <w:vAlign w:val="center"/>
+            <w:shd w:fill="E8EEF5"/>
+            <w:tcBorders>
+              <w:top w:val="single" w:sz="6" w:color="D7DBE2"/>
+              <w:left w:val="single" w:sz="6" w:color="D7DBE2"/>
+              <w:bottom w:val="single" w:sz="6" w:color="D7DBE2"/>
+              <w:right w:val="single" w:sz="6" w:color="D7DBE2"/>
+            </w:tcBorders>
+          </w:tcPr>
+          <w:p>
+            <w:pPr>
+              <w:keepNext w:val="0"/>
+              <w:spacing w:before="0" w:after="0" w:line="240" w:lineRule="auto"/>
+            </w:pPr>
+            <w:r>
+              <w:rPr>
+                <w:rFonts w:ascii="Calibri" w:hAnsi="Calibri"/>
+                <w:b/>
+                <w:i w:val="0"/>
+                <w:color w:val="1F4D78"/>
+                <w:sz w:val="20"/>
+              </w:rPr>
+              <w:t>EXISTING MATTER</w:t>
+            </w:r>
+          </w:p>
+        </w:tc>
+        <w:tc>
+          <w:tcPr>
+            <w:tcW w:type="dxa" w:w="3120"/>
+            <w:tcMar>
+              <w:top w:w="80" w:type="dxa"/>
+              <w:start w:w="120" w:type="dxa"/>
+              <w:bottom w:w="80" w:type="dxa"/>
+              <w:end w:w="120" w:type="dxa"/>
+            </w:tcMar>
+            <w:vAlign w:val="center"/>
+            <w:shd w:fill="E8EEF5"/>
+            <w:tcBorders>
+              <w:top w:val="single" w:sz="6" w:color="D7DBE2"/>
+              <w:left w:val="single" w:sz="6" w:color="D7DBE2"/>
+              <w:bottom w:val="single" w:sz="6" w:color="D7DBE2"/>
+              <w:right w:val="single" w:sz="6" w:color="D7DBE2"/>
+            </w:tcBorders>
+          </w:tcPr>
+          <w:p>
+            <w:pPr>
+              <w:keepNext w:val="0"/>
+              <w:spacing w:before="0" w:after="0" w:line="240" w:lineRule="auto"/>
+            </w:pPr>
+            <w:r>
+              <w:rPr>
+                <w:rFonts w:ascii="Calibri" w:hAnsi="Calibri"/>
+                <w:b/>
+                <w:i w:val="0"/>
+                <w:color w:val="1F4D78"/>
+                <w:sz w:val="20"/>
+              </w:rPr>
+              <w:t>DUPLICATE / NO ACTION</w:t>
+            </w:r>
+          </w:p>
+        </w:tc>
+      </w:tr>
+      <w:tr>
+        <w:tc>
+          <w:tcPr>
+            <w:tcW w:type="dxa" w:w="3120"/>
+            <w:tcBorders>
+              <w:top w:val="single" w:sz="6" w:color="D7DBE2"/>
+              <w:left w:val="single" w:sz="6" w:color="D7DBE2"/>
+              <w:bottom w:val="single" w:sz="6" w:color="D7DBE2"/>
+              <w:right w:val="single" w:sz="6" w:color="D7DBE2"/>
+            </w:tcBorders>
+            <w:tcMar>
+              <w:top w:w="80" w:type="dxa"/>
+              <w:start w:w="120" w:type="dxa"/>
+              <w:bottom w:w="80" w:type="dxa"/>
+              <w:end w:w="120" w:type="dxa"/>
+            </w:tcMar>
+            <w:vAlign w:val="center"/>
+          </w:tcPr>
+          <w:p>
+            <w:pPr>
+              <w:keepNext w:val="0"/>
+              <w:spacing w:before="0" w:after="0" w:line="276" w:lineRule="auto"/>
+            </w:pPr>
+            <w:r>
+              <w:rPr>
+                <w:rFonts w:ascii="Calibri" w:hAnsi="Calibri"/>
+                <w:b w:val="0"/>
+                <w:i w:val="0"/>
+                <w:color w:val="20252B"/>
+                <w:sz w:val="20"/>
+              </w:rPr>
+              <w:t>Raise a case</w:t>
+              <w:br/>
+              <w:t>No email is sent</w:t>
+            </w:r>
+          </w:p>
+        </w:tc>
+        <w:tc>
+          <w:tcPr>
+            <w:tcW w:type="dxa" w:w="3120"/>
+            <w:tcBorders>
+              <w:top w:val="single" w:sz="6" w:color="D7DBE2"/>
+              <w:left w:val="single" w:sz="6" w:color="D7DBE2"/>
+              <w:bottom w:val="single" w:sz="6" w:color="D7DBE2"/>
+              <w:right w:val="single" w:sz="6" w:color="D7DBE2"/>
+            </w:tcBorders>
+            <w:tcMar>
+              <w:top w:w="80" w:type="dxa"/>
+              <w:start w:w="120" w:type="dxa"/>
+              <w:bottom w:w="80" w:type="dxa"/>
+              <w:end w:w="120" w:type="dxa"/>
+            </w:tcMar>
+            <w:vAlign w:val="center"/>
+          </w:tcPr>
+          <w:p>
+            <w:pPr>
+              <w:keepNext w:val="0"/>
+              <w:spacing w:before="0" w:after="0" w:line="276" w:lineRule="auto"/>
+            </w:pPr>
+            <w:r>
+              <w:rPr>
+                <w:rFonts w:ascii="Calibri" w:hAnsi="Calibri"/>
+                <w:b/>
+                <w:i w:val="0"/>
+                <w:color w:val="20252B"/>
+                <w:sz w:val="20"/>
+              </w:rPr>
+              <w:t>Link to the existing case</w:t>
+            </w:r>
+          </w:p>
+        </w:tc>
+        <w:tc>
+          <w:tcPr>
+            <w:tcW w:type="dxa" w:w="3120"/>
+            <w:tcBorders>
+              <w:top w:val="single" w:sz="6" w:color="D7DBE2"/>
+              <w:left w:val="single" w:sz="6" w:color="D7DBE2"/>
+              <w:bottom w:val="single" w:sz="6" w:color="D7DBE2"/>
+              <w:right w:val="single" w:sz="6" w:color="D7DBE2"/>
+            </w:tcBorders>
+            <w:tcMar>
+              <w:top w:w="80" w:type="dxa"/>
+              <w:start w:w="120" w:type="dxa"/>
+              <w:bottom w:w="80" w:type="dxa"/>
+              <w:end w:w="120" w:type="dxa"/>
+            </w:tcMar>
+            <w:vAlign w:val="center"/>
+          </w:tcPr>
+          <w:p>
+            <w:pPr>
+              <w:keepNext w:val="0"/>
+              <w:spacing w:before="0" w:after="0" w:line="276" w:lineRule="auto"/>
+            </w:pPr>
+            <w:r>
+              <w:rPr>
+                <w:rFonts w:ascii="Calibri" w:hAnsi="Calibri"/>
+                <w:b w:val="0"/>
+                <w:i w:val="0"/>
+                <w:color w:val="20252B"/>
+                <w:sz w:val="20"/>
+              </w:rPr>
+              <w:t>Resolve the report with a reason</w:t>
+            </w:r>
+          </w:p>
+        </w:tc>
+      </w:tr>
+    </w:tbl>
+    <w:p>
+      <w:pPr>
+        <w:keepNext w:val="0"/>
+        <w:spacing w:before="0" w:after="40" w:line="240" w:lineRule="auto"/>
+        <w:jc w:val="center"/>
+      </w:pPr>
+      <w:r>
+        <w:rPr>
+          <w:rFonts w:ascii="Calibri" w:hAnsi="Calibri"/>
+          <w:b/>
+          <w:i w:val="0"/>
+          <w:color w:val="2E74B5"/>
+          <w:sz w:val="32"/>
+        </w:rPr>
+        <w:t>↓</w:t>
+      </w:r>
+    </w:p>
+    <w:tbl>
+      <w:tblPr>
+        <w:tblW w:type="dxa" w:w="9360"/>
+        <w:jc w:val="left"/>
+        <w:tblLayout w:type="fixed"/>
+        <w:tblLook w:firstColumn="1" w:firstRow="1" w:lastColumn="0" w:lastRow="0" w:noHBand="0" w:noVBand="1" w:val="04A0"/>
+        <w:tblInd w:w="120" w:type="dxa"/>
+      </w:tblPr>
+      <w:tblGrid>
+        <w:gridCol w:w="9360"/>
+      </w:tblGrid>
+      <w:tr>
+        <w:tc>
+          <w:tcPr>
+            <w:tcW w:type="dxa" w:w="9360"/>
+            <w:tcMar>
+              <w:top w:w="80" w:type="dxa"/>
+              <w:start w:w="120" w:type="dxa"/>
+              <w:bottom w:w="80" w:type="dxa"/>
+              <w:end w:w="120" w:type="dxa"/>
+            </w:tcMar>
+            <w:vAlign w:val="center"/>
+            <w:shd w:fill="E9F5EC"/>
+            <w:tcBorders>
+              <w:left w:val="single" w:sz="18" w:color="397A45"/>
+            </w:tcBorders>
+          </w:tcPr>
+          <w:p>
+            <w:pPr>
+              <w:keepNext w:val="0"/>
+              <w:spacing w:before="0" w:after="0" w:line="300" w:lineRule="auto"/>
+            </w:pPr>
+            <w:r>
+              <w:rPr>
+                <w:rFonts w:ascii="Calibri" w:hAnsi="Calibri"/>
+                <w:b/>
+                <w:i w:val="0"/>
+                <w:color w:val="397A45"/>
+                <w:sz w:val="18"/>
+              </w:rPr>
+              <w:t xml:space="preserve">3  CASE CONTROL  </w:t>
+            </w:r>
+            <w:r>
+              <w:rPr>
+                <w:rFonts w:ascii="Calibri" w:hAnsi="Calibri"/>
+                <w:b w:val="0"/>
+                <w:i w:val="0"/>
+                <w:color w:val="20252B"/>
+                <w:sz w:val="22"/>
+              </w:rPr>
+              <w:t>Investigate and contact the club  -&gt;  prepare a decision  -&gt;  independent approval  -&gt;  issue approved outcomes.</w:t>
+            </w:r>
+          </w:p>
+        </w:tc>
+      </w:tr>
+    </w:tbl>
+    <w:p>
+      <w:pPr>
+        <w:keepNext w:val="0"/>
+        <w:spacing w:before="0" w:after="0" w:line="240" w:lineRule="auto"/>
+      </w:pPr>
+    </w:p>
+    <w:p>
+      <w:pPr>
+        <w:pStyle w:val="Heading2"/>
+      </w:pPr>
+      <w:r>
+        <w:t>What this protects</w:t>
+      </w:r>
+    </w:p>
+    <w:p>
+      <w:pPr>
+        <w:keepNext w:val="0"/>
+        <w:spacing w:before="0" w:after="80" w:line="300" w:lineRule="auto"/>
+        <w:numPr>
+          <w:ilvl w:val="0"/>
+          <w:numId w:val="212"/>
+        </w:numPr>
+      </w:pPr>
+      <w:r>
+        <w:rPr>
+          <w:rFonts w:ascii="Calibri" w:hAnsi="Calibri"/>
+          <w:b w:val="0"/>
+          <w:i w:val="0"/>
+          <w:color w:val="20252B"/>
+          <w:sz w:val="22"/>
+        </w:rPr>
+        <w:t>The supplied source remains complete and unchanged.</w:t>
+      </w:r>
+    </w:p>
+    <w:p>
+      <w:pPr>
+        <w:keepNext w:val="0"/>
+        <w:spacing w:before="0" w:after="80" w:line="300" w:lineRule="auto"/>
+        <w:numPr>
+          <w:ilvl w:val="0"/>
+          <w:numId w:val="212"/>
+        </w:numPr>
+      </w:pPr>
+      <w:r>
+        <w:rPr>
+          <w:rFonts w:ascii="Calibri" w:hAnsi="Calibri"/>
+          <w:b w:val="0"/>
+          <w:i w:val="0"/>
+          <w:color w:val="20252B"/>
+          <w:sz w:val="22"/>
+        </w:rPr>
+        <w:t>The active workload is explicit, reversible and auditable.</w:t>
+      </w:r>
+    </w:p>
+    <w:p>
+      <w:pPr>
+        <w:keepNext w:val="0"/>
+        <w:spacing w:before="0" w:after="80" w:line="300" w:lineRule="auto"/>
+        <w:numPr>
+          <w:ilvl w:val="0"/>
+          <w:numId w:val="212"/>
+        </w:numPr>
+      </w:pPr>
+      <w:r>
+        <w:rPr>
+          <w:rFonts w:ascii="Calibri" w:hAnsi="Calibri"/>
+          <w:b w:val="0"/>
+          <w:i w:val="0"/>
+          <w:color w:val="20252B"/>
+          <w:sz w:val="22"/>
+        </w:rPr>
+        <w:t>Selection alone cannot create a case, contact a club or impose an outcome.</w:t>
+      </w:r>
+    </w:p>
     <w:sectPr>
       <w:headerReference w:type="default" r:id="rId9"/>
       <w:footerReference w:type="default" r:id="rId10"/>
@@ -3339,6 +4373,12 @@
     </w:lvlOverride>
   </w:num>
   <w:num w:numId="211">
+    <w:abstractNumId w:val="91"/>
+    <w:lvlOverride w:ilvl="0">
+      <w:startOverride w:val="1"/>
+    </w:lvlOverride>
+  </w:num>
+  <w:num w:numId="212">
     <w:abstractNumId w:val="91"/>
     <w:lvlOverride w:ilvl="0">
       <w:startOverride w:val="1"/>

</xml_diff>

<commit_message>
Clarify ineligible import selection
</commit_message>
<xml_diff>
--- a/outputs/ineligible-guide/GMCL_Ineligible_Player_Quick_Guide.docx
+++ b/outputs/ineligible-guide/GMCL_Ineligible_Player_Quick_Guide.docx
@@ -1418,7 +1418,7 @@
                 <w:color w:val="20252B"/>
                 <w:sz w:val="22"/>
               </w:rPr>
-              <w:t>The system cannot see blue cell formatting. Import the full configured response sheet, then tick the exact reports to progress. Do not delete or reorder rows in the live response sheet.</w:t>
+              <w:t>Import the full configured Google response sheet. Do not delete, copy or reorder live response rows; choose the active work on the next screen.</w:t>
             </w:r>
           </w:p>
         </w:tc>
@@ -1447,7 +1447,7 @@
           <w:color w:val="20252B"/>
           <w:sz w:val="22"/>
         </w:rPr>
-        <w:t>Make sure the reports are present in the private Google Form response sheet.</w:t>
+        <w:t>Make sure the required reports are present in the private Google Form response sheet.</w:t>
       </w:r>
     </w:p>
     <w:p>
@@ -1567,7 +1567,7 @@
           <w:color w:val="20252B"/>
           <w:sz w:val="22"/>
         </w:rPr>
-        <w:t>Wait for the confirmation showing how many responses were seen, added, changed or returned errors.</w:t>
+        <w:t>Read the summary. Source rows read is every Google response; added and changed are database updates, so zero is normal on a repeat import.</w:t>
       </w:r>
     </w:p>
     <w:p>
@@ -1587,7 +1587,87 @@
           <w:color w:val="20252B"/>
           <w:sz w:val="22"/>
         </w:rPr>
-        <w:t xml:space="preserve">On Choose the reports to progress, tick </w:t>
+        <w:t xml:space="preserve">If the page says </w:t>
+      </w:r>
+      <w:r>
+        <w:rPr>
+          <w:rFonts w:ascii="Calibri" w:hAnsi="Calibri"/>
+          <w:b/>
+          <w:i w:val="0"/>
+          <w:color w:val="20252B"/>
+          <w:sz w:val="22"/>
+        </w:rPr>
+        <w:t>Selection is blocked</w:t>
+      </w:r>
+      <w:r>
+        <w:rPr>
+          <w:rFonts w:ascii="Calibri" w:hAnsi="Calibri"/>
+          <w:b w:val="0"/>
+          <w:i w:val="0"/>
+          <w:color w:val="20252B"/>
+          <w:sz w:val="22"/>
+        </w:rPr>
+        <w:t>, record the import number and error, plus any spreadsheet row shown, then stop for import or identity help.</w:t>
+      </w:r>
+    </w:p>
+    <w:p>
+      <w:pPr>
+        <w:keepNext w:val="0"/>
+        <w:spacing w:before="0" w:after="80" w:line="300" w:lineRule="auto"/>
+        <w:numPr>
+          <w:ilvl w:val="0"/>
+          <w:numId w:val="204"/>
+        </w:numPr>
+      </w:pPr>
+      <w:r>
+        <w:rPr>
+          <w:rFonts w:ascii="Calibri" w:hAnsi="Calibri"/>
+          <w:b w:val="0"/>
+          <w:i w:val="0"/>
+          <w:color w:val="20252B"/>
+          <w:sz w:val="22"/>
+        </w:rPr>
+        <w:t xml:space="preserve">Use </w:t>
+      </w:r>
+      <w:r>
+        <w:rPr>
+          <w:rFonts w:ascii="Calibri" w:hAnsi="Calibri"/>
+          <w:b/>
+          <w:i w:val="0"/>
+          <w:color w:val="20252B"/>
+          <w:sz w:val="22"/>
+        </w:rPr>
+        <w:t>Fixture from</w:t>
+      </w:r>
+      <w:r>
+        <w:rPr>
+          <w:rFonts w:ascii="Calibri" w:hAnsi="Calibri"/>
+          <w:b w:val="0"/>
+          <w:i w:val="0"/>
+          <w:color w:val="20252B"/>
+          <w:sz w:val="22"/>
+        </w:rPr>
+        <w:t>, Fixture to, Order or search to find the current handover.</w:t>
+      </w:r>
+    </w:p>
+    <w:p>
+      <w:pPr>
+        <w:keepNext w:val="0"/>
+        <w:spacing w:before="0" w:after="80" w:line="300" w:lineRule="auto"/>
+        <w:numPr>
+          <w:ilvl w:val="0"/>
+          <w:numId w:val="204"/>
+        </w:numPr>
+      </w:pPr>
+      <w:r>
+        <w:rPr>
+          <w:rFonts w:ascii="Calibri" w:hAnsi="Calibri"/>
+          <w:b w:val="0"/>
+          <w:i w:val="0"/>
+          <w:color w:val="20252B"/>
+          <w:sz w:val="22"/>
+        </w:rPr>
+        <w:t xml:space="preserve">Tick </w:t>
       </w:r>
       <w:r>
         <w:rPr>
@@ -1607,7 +1687,7 @@
           <w:color w:val="20252B"/>
           <w:sz w:val="22"/>
         </w:rPr>
-        <w:t xml:space="preserve"> beside every required report.</w:t>
+        <w:t xml:space="preserve"> or use Select all shown. Filtering never unticks a report already selected.</w:t>
       </w:r>
     </w:p>
     <w:p>
@@ -1627,7 +1707,7 @@
           <w:color w:val="20252B"/>
           <w:sz w:val="22"/>
         </w:rPr>
-        <w:t xml:space="preserve">Check the total. For the Rev 8 blue-row handover, it should show </w:t>
+        <w:t xml:space="preserve">Check the selected total against the current handover, enter a label such as </w:t>
       </w:r>
       <w:r>
         <w:rPr>
@@ -1637,7 +1717,7 @@
           <w:color w:val="20252B"/>
           <w:sz w:val="22"/>
         </w:rPr>
-        <w:t>18 selected</w:t>
+        <w:t>Dave handover - 11 Aug 2026</w:t>
       </w:r>
       <w:r>
         <w:rPr>
@@ -1647,87 +1727,7 @@
           <w:color w:val="20252B"/>
           <w:sz w:val="22"/>
         </w:rPr>
-        <w:t>.</w:t>
-      </w:r>
-    </w:p>
-    <w:p>
-      <w:pPr>
-        <w:keepNext w:val="0"/>
-        <w:spacing w:before="0" w:after="80" w:line="300" w:lineRule="auto"/>
-        <w:numPr>
-          <w:ilvl w:val="0"/>
-          <w:numId w:val="204"/>
-        </w:numPr>
-      </w:pPr>
-      <w:r>
-        <w:rPr>
-          <w:rFonts w:ascii="Calibri" w:hAnsi="Calibri"/>
-          <w:b w:val="0"/>
-          <w:i w:val="0"/>
-          <w:color w:val="20252B"/>
-          <w:sz w:val="22"/>
-        </w:rPr>
-        <w:t xml:space="preserve">Enter a short reason such as </w:t>
-      </w:r>
-      <w:r>
-        <w:rPr>
-          <w:rFonts w:ascii="Calibri" w:hAnsi="Calibri"/>
-          <w:b/>
-          <w:i w:val="0"/>
-          <w:color w:val="20252B"/>
-          <w:sz w:val="22"/>
-        </w:rPr>
-        <w:t>Rev 8 blue rows</w:t>
-      </w:r>
-      <w:r>
-        <w:rPr>
-          <w:rFonts w:ascii="Calibri" w:hAnsi="Calibri"/>
-          <w:b w:val="0"/>
-          <w:i w:val="0"/>
-          <w:color w:val="20252B"/>
-          <w:sz w:val="22"/>
-        </w:rPr>
-        <w:t>.</w:t>
-      </w:r>
-    </w:p>
-    <w:p>
-      <w:pPr>
-        <w:keepNext w:val="0"/>
-        <w:spacing w:before="0" w:after="80" w:line="300" w:lineRule="auto"/>
-        <w:numPr>
-          <w:ilvl w:val="0"/>
-          <w:numId w:val="204"/>
-        </w:numPr>
-      </w:pPr>
-      <w:r>
-        <w:rPr>
-          <w:rFonts w:ascii="Calibri" w:hAnsi="Calibri"/>
-          <w:b w:val="0"/>
-          <w:i w:val="0"/>
-          <w:color w:val="20252B"/>
-          <w:sz w:val="22"/>
-        </w:rPr>
-        <w:t xml:space="preserve">Click </w:t>
-      </w:r>
-      <w:r>
-        <w:rPr>
-          <w:rFonts w:ascii="Calibri" w:hAnsi="Calibri"/>
-          <w:b/>
-          <w:i w:val="0"/>
-          <w:color w:val="20252B"/>
-          <w:sz w:val="22"/>
-        </w:rPr>
-        <w:t>Save selection and show work queue</w:t>
-      </w:r>
-      <w:r>
-        <w:rPr>
-          <w:rFonts w:ascii="Calibri" w:hAnsi="Calibri"/>
-          <w:b w:val="0"/>
-          <w:i w:val="0"/>
-          <w:color w:val="20252B"/>
-          <w:sz w:val="22"/>
-        </w:rPr>
-        <w:t>.</w:t>
+        <w:t>, then save.</w:t>
       </w:r>
     </w:p>
     <w:p>
@@ -1767,7 +1767,15 @@
           <w:color w:val="20252B"/>
           <w:sz w:val="22"/>
         </w:rPr>
-        <w:t xml:space="preserve"> beside the first selected report.</w:t>
+        <w:t xml:space="preserve"> beside the first selected report and follow Route 1.</w:t>
+      </w:r>
+    </w:p>
+    <w:p>
+      <w:pPr>
+        <w:pStyle w:val="Heading2"/>
+      </w:pPr>
+      <w:r>
+        <w:t>If a report looks missing</w:t>
       </w:r>
     </w:p>
     <w:p>
@@ -1776,7 +1784,7 @@
         <w:spacing w:before="0" w:after="80" w:line="300" w:lineRule="auto"/>
         <w:numPr>
           <w:ilvl w:val="0"/>
-          <w:numId w:val="204"/>
+          <w:numId w:val="205"/>
         </w:numPr>
       </w:pPr>
       <w:r>
@@ -1787,7 +1795,67 @@
           <w:color w:val="20252B"/>
           <w:sz w:val="22"/>
         </w:rPr>
-        <w:t>Follow Route 1 from the Reported details check, then return to the queue and repeat.</w:t>
+        <w:t>Clear the search and fixture-date filters.</w:t>
+      </w:r>
+    </w:p>
+    <w:p>
+      <w:pPr>
+        <w:keepNext w:val="0"/>
+        <w:spacing w:before="0" w:after="80" w:line="300" w:lineRule="auto"/>
+        <w:numPr>
+          <w:ilvl w:val="0"/>
+          <w:numId w:val="205"/>
+        </w:numPr>
+      </w:pPr>
+      <w:r>
+        <w:rPr>
+          <w:rFonts w:ascii="Calibri" w:hAnsi="Calibri"/>
+          <w:b w:val="0"/>
+          <w:i w:val="0"/>
+          <w:color w:val="20252B"/>
+          <w:sz w:val="22"/>
+        </w:rPr>
+        <w:t>Open Report history and search for the player.</w:t>
+      </w:r>
+    </w:p>
+    <w:p>
+      <w:pPr>
+        <w:keepNext w:val="0"/>
+        <w:spacing w:before="0" w:after="80" w:line="300" w:lineRule="auto"/>
+        <w:numPr>
+          <w:ilvl w:val="0"/>
+          <w:numId w:val="205"/>
+        </w:numPr>
+      </w:pPr>
+      <w:r>
+        <w:rPr>
+          <w:rFonts w:ascii="Calibri" w:hAnsi="Calibri"/>
+          <w:b w:val="0"/>
+          <w:i w:val="0"/>
+          <w:color w:val="20252B"/>
+          <w:sz w:val="22"/>
+        </w:rPr>
+        <w:t>Do not select the report again if it is already case-raised, linked, duplicate or ignored.</w:t>
+      </w:r>
+    </w:p>
+    <w:p>
+      <w:pPr>
+        <w:keepNext w:val="0"/>
+        <w:spacing w:before="0" w:after="80" w:line="300" w:lineRule="auto"/>
+        <w:numPr>
+          <w:ilvl w:val="0"/>
+          <w:numId w:val="205"/>
+        </w:numPr>
+      </w:pPr>
+      <w:r>
+        <w:rPr>
+          <w:rFonts w:ascii="Calibri" w:hAnsi="Calibri"/>
+          <w:b w:val="0"/>
+          <w:i w:val="0"/>
+          <w:color w:val="20252B"/>
+          <w:sz w:val="22"/>
+        </w:rPr>
+        <w:t>Treat one spreadsheet row as one report, even when its Player box contains several names.</w:t>
       </w:r>
     </w:p>
     <w:tbl>
@@ -1840,7 +1908,7 @@
                 <w:color w:val="20252B"/>
                 <w:sz w:val="22"/>
               </w:rPr>
-              <w:t>Selected reports appear in the normal queue. Unselected reports are hidden, not deleted, and remain available under View hidden reports or All imported.</w:t>
+              <w:t>Selected open reports appear in the normal queue. Unselected open reports are hidden, not deleted. Progressed reports remain in Report history.</w:t>
             </w:r>
           </w:p>
         </w:tc>
@@ -1892,7 +1960,7 @@
                 <w:color w:val="2E74B5"/>
                 <w:sz w:val="18"/>
               </w:rPr>
-              <w:t xml:space="preserve">NEW SUBMISSIONS  </w:t>
+              <w:t xml:space="preserve">NEED ATTENTION  </w:t>
             </w:r>
             <w:r>
               <w:rPr>
@@ -1902,7 +1970,7 @@
                 <w:color w:val="20252B"/>
                 <w:sz w:val="22"/>
               </w:rPr>
-              <w:t>A report received after selection stays visible as New - not yet chosen until the next selection.</w:t>
+              <w:t>A row warning does not automatically mean the report is missing. Read the warning shown beside that report; only an identity or manifest problem blocks selection.</w:t>
             </w:r>
           </w:p>
         </w:tc>
@@ -2003,7 +2071,7 @@
         <w:spacing w:before="0" w:after="80" w:line="300" w:lineRule="auto"/>
         <w:numPr>
           <w:ilvl w:val="0"/>
-          <w:numId w:val="205"/>
+          <w:numId w:val="206"/>
         </w:numPr>
       </w:pPr>
       <w:r>
@@ -2063,7 +2131,7 @@
         <w:spacing w:before="0" w:after="80" w:line="300" w:lineRule="auto"/>
         <w:numPr>
           <w:ilvl w:val="0"/>
-          <w:numId w:val="205"/>
+          <w:numId w:val="206"/>
         </w:numPr>
       </w:pPr>
       <w:r>
@@ -2103,7 +2171,7 @@
         <w:spacing w:before="0" w:after="80" w:line="300" w:lineRule="auto"/>
         <w:numPr>
           <w:ilvl w:val="0"/>
-          <w:numId w:val="205"/>
+          <w:numId w:val="206"/>
         </w:numPr>
       </w:pPr>
       <w:r>
@@ -2143,7 +2211,7 @@
         <w:spacing w:before="0" w:after="80" w:line="300" w:lineRule="auto"/>
         <w:numPr>
           <w:ilvl w:val="0"/>
-          <w:numId w:val="205"/>
+          <w:numId w:val="206"/>
         </w:numPr>
       </w:pPr>
       <w:r>
@@ -2163,7 +2231,7 @@
         <w:spacing w:before="0" w:after="80" w:line="300" w:lineRule="auto"/>
         <w:numPr>
           <w:ilvl w:val="0"/>
-          <w:numId w:val="205"/>
+          <w:numId w:val="206"/>
         </w:numPr>
       </w:pPr>
       <w:r>
@@ -2237,7 +2305,7 @@
         <w:spacing w:before="0" w:after="80" w:line="300" w:lineRule="auto"/>
         <w:numPr>
           <w:ilvl w:val="0"/>
-          <w:numId w:val="206"/>
+          <w:numId w:val="207"/>
         </w:numPr>
       </w:pPr>
       <w:r>
@@ -2277,7 +2345,7 @@
         <w:spacing w:before="0" w:after="80" w:line="300" w:lineRule="auto"/>
         <w:numPr>
           <w:ilvl w:val="0"/>
-          <w:numId w:val="206"/>
+          <w:numId w:val="207"/>
         </w:numPr>
       </w:pPr>
       <w:r>
@@ -2317,7 +2385,7 @@
         <w:spacing w:before="0" w:after="80" w:line="300" w:lineRule="auto"/>
         <w:numPr>
           <w:ilvl w:val="0"/>
-          <w:numId w:val="206"/>
+          <w:numId w:val="207"/>
         </w:numPr>
       </w:pPr>
       <w:r>
@@ -2337,7 +2405,7 @@
         <w:spacing w:before="0" w:after="80" w:line="300" w:lineRule="auto"/>
         <w:numPr>
           <w:ilvl w:val="0"/>
-          <w:numId w:val="206"/>
+          <w:numId w:val="207"/>
         </w:numPr>
       </w:pPr>
       <w:r>
@@ -2377,7 +2445,7 @@
         <w:spacing w:before="0" w:after="80" w:line="300" w:lineRule="auto"/>
         <w:numPr>
           <w:ilvl w:val="0"/>
-          <w:numId w:val="206"/>
+          <w:numId w:val="207"/>
         </w:numPr>
       </w:pPr>
       <w:r>
@@ -2441,7 +2509,7 @@
         <w:spacing w:before="0" w:after="80" w:line="300" w:lineRule="auto"/>
         <w:numPr>
           <w:ilvl w:val="0"/>
-          <w:numId w:val="207"/>
+          <w:numId w:val="208"/>
         </w:numPr>
       </w:pPr>
       <w:r>
@@ -2461,7 +2529,7 @@
         <w:spacing w:before="0" w:after="80" w:line="300" w:lineRule="auto"/>
         <w:numPr>
           <w:ilvl w:val="0"/>
-          <w:numId w:val="207"/>
+          <w:numId w:val="208"/>
         </w:numPr>
       </w:pPr>
       <w:r>
@@ -2481,7 +2549,7 @@
         <w:spacing w:before="0" w:after="80" w:line="300" w:lineRule="auto"/>
         <w:numPr>
           <w:ilvl w:val="0"/>
-          <w:numId w:val="207"/>
+          <w:numId w:val="208"/>
         </w:numPr>
       </w:pPr>
       <w:r>
@@ -2501,7 +2569,7 @@
         <w:spacing w:before="0" w:after="80" w:line="300" w:lineRule="auto"/>
         <w:numPr>
           <w:ilvl w:val="0"/>
-          <w:numId w:val="207"/>
+          <w:numId w:val="208"/>
         </w:numPr>
       </w:pPr>
       <w:r>
@@ -2521,7 +2589,7 @@
         <w:spacing w:before="0" w:after="80" w:line="300" w:lineRule="auto"/>
         <w:numPr>
           <w:ilvl w:val="0"/>
-          <w:numId w:val="207"/>
+          <w:numId w:val="208"/>
         </w:numPr>
       </w:pPr>
       <w:r>
@@ -2644,7 +2712,7 @@
         <w:spacing w:before="0" w:after="80" w:line="300" w:lineRule="auto"/>
         <w:numPr>
           <w:ilvl w:val="0"/>
-          <w:numId w:val="208"/>
+          <w:numId w:val="209"/>
         </w:numPr>
       </w:pPr>
       <w:r>
@@ -2684,7 +2752,7 @@
         <w:spacing w:before="0" w:after="80" w:line="300" w:lineRule="auto"/>
         <w:numPr>
           <w:ilvl w:val="0"/>
-          <w:numId w:val="208"/>
+          <w:numId w:val="209"/>
         </w:numPr>
       </w:pPr>
       <w:r>
@@ -2704,7 +2772,7 @@
         <w:spacing w:before="0" w:after="80" w:line="300" w:lineRule="auto"/>
         <w:numPr>
           <w:ilvl w:val="0"/>
-          <w:numId w:val="208"/>
+          <w:numId w:val="209"/>
         </w:numPr>
       </w:pPr>
       <w:r>
@@ -2724,7 +2792,7 @@
         <w:spacing w:before="0" w:after="80" w:line="300" w:lineRule="auto"/>
         <w:numPr>
           <w:ilvl w:val="0"/>
-          <w:numId w:val="208"/>
+          <w:numId w:val="209"/>
         </w:numPr>
       </w:pPr>
       <w:r>
@@ -2772,7 +2840,7 @@
         <w:spacing w:before="0" w:after="80" w:line="300" w:lineRule="auto"/>
         <w:numPr>
           <w:ilvl w:val="0"/>
-          <w:numId w:val="209"/>
+          <w:numId w:val="210"/>
         </w:numPr>
       </w:pPr>
       <w:r>
@@ -2792,7 +2860,7 @@
         <w:spacing w:before="0" w:after="80" w:line="300" w:lineRule="auto"/>
         <w:numPr>
           <w:ilvl w:val="0"/>
-          <w:numId w:val="209"/>
+          <w:numId w:val="210"/>
         </w:numPr>
       </w:pPr>
       <w:r>
@@ -2812,7 +2880,7 @@
         <w:spacing w:before="0" w:after="80" w:line="300" w:lineRule="auto"/>
         <w:numPr>
           <w:ilvl w:val="0"/>
-          <w:numId w:val="209"/>
+          <w:numId w:val="210"/>
         </w:numPr>
       </w:pPr>
       <w:r>
@@ -2984,7 +3052,7 @@
         <w:spacing w:before="0" w:after="80" w:line="300" w:lineRule="auto"/>
         <w:numPr>
           <w:ilvl w:val="0"/>
-          <w:numId w:val="210"/>
+          <w:numId w:val="211"/>
         </w:numPr>
       </w:pPr>
       <w:r>
@@ -3004,7 +3072,7 @@
         <w:spacing w:before="0" w:after="80" w:line="300" w:lineRule="auto"/>
         <w:numPr>
           <w:ilvl w:val="0"/>
-          <w:numId w:val="210"/>
+          <w:numId w:val="211"/>
         </w:numPr>
       </w:pPr>
       <w:r>
@@ -3024,7 +3092,7 @@
         <w:spacing w:before="0" w:after="80" w:line="300" w:lineRule="auto"/>
         <w:numPr>
           <w:ilvl w:val="0"/>
-          <w:numId w:val="210"/>
+          <w:numId w:val="211"/>
         </w:numPr>
       </w:pPr>
       <w:r>
@@ -3044,7 +3112,7 @@
         <w:spacing w:before="0" w:after="80" w:line="300" w:lineRule="auto"/>
         <w:numPr>
           <w:ilvl w:val="0"/>
-          <w:numId w:val="210"/>
+          <w:numId w:val="211"/>
         </w:numPr>
       </w:pPr>
       <w:r>
@@ -3064,7 +3132,7 @@
         <w:spacing w:before="0" w:after="80" w:line="300" w:lineRule="auto"/>
         <w:numPr>
           <w:ilvl w:val="0"/>
-          <w:numId w:val="210"/>
+          <w:numId w:val="211"/>
         </w:numPr>
       </w:pPr>
       <w:r>
@@ -3084,7 +3152,7 @@
         <w:spacing w:before="0" w:after="80" w:line="300" w:lineRule="auto"/>
         <w:numPr>
           <w:ilvl w:val="0"/>
-          <w:numId w:val="210"/>
+          <w:numId w:val="211"/>
         </w:numPr>
       </w:pPr>
       <w:r>
@@ -3112,7 +3180,7 @@
         <w:spacing w:before="0" w:after="80" w:line="300" w:lineRule="auto"/>
         <w:numPr>
           <w:ilvl w:val="0"/>
-          <w:numId w:val="211"/>
+          <w:numId w:val="212"/>
         </w:numPr>
       </w:pPr>
       <w:r>
@@ -3132,7 +3200,7 @@
         <w:spacing w:before="0" w:after="80" w:line="300" w:lineRule="auto"/>
         <w:numPr>
           <w:ilvl w:val="0"/>
-          <w:numId w:val="211"/>
+          <w:numId w:val="212"/>
         </w:numPr>
       </w:pPr>
       <w:r>
@@ -3152,7 +3220,7 @@
         <w:spacing w:before="0" w:after="80" w:line="300" w:lineRule="auto"/>
         <w:numPr>
           <w:ilvl w:val="0"/>
-          <w:numId w:val="211"/>
+          <w:numId w:val="212"/>
         </w:numPr>
       </w:pPr>
       <w:r>
@@ -3192,7 +3260,7 @@
           <w:color w:val="20252B"/>
           <w:sz w:val="22"/>
         </w:rPr>
-        <w:t>The control is deliberate at every stage: import everything, select the active workload, review one report at a time and require independent approval before any outcome.</w:t>
+        <w:t>Every source row is accounted for, but only open and unlinked reports are offered for selection.</w:t>
       </w:r>
     </w:p>
     <w:tbl>
@@ -3245,7 +3313,7 @@
                 <w:color w:val="20252B"/>
                 <w:sz w:val="22"/>
               </w:rPr>
-              <w:t>All configured Google Form responses are imported into the private intake area. Nothing is deleted and no case or email is created.</w:t>
+              <w:t>Read every configured Google Form response into the private intake area. Nothing is deleted and no case or email is created.</w:t>
             </w:r>
           </w:p>
         </w:tc>
@@ -3257,6 +3325,248 @@
         <w:spacing w:before="0" w:after="0" w:line="240" w:lineRule="auto"/>
       </w:pPr>
     </w:p>
+    <w:p>
+      <w:pPr>
+        <w:keepNext w:val="0"/>
+        <w:spacing w:before="0" w:after="40" w:line="240" w:lineRule="auto"/>
+        <w:jc w:val="center"/>
+      </w:pPr>
+      <w:r>
+        <w:rPr>
+          <w:rFonts w:ascii="Calibri" w:hAnsi="Calibri"/>
+          <w:b/>
+          <w:i w:val="0"/>
+          <w:color w:val="2E74B5"/>
+          <w:sz w:val="32"/>
+        </w:rPr>
+        <w:t>↓</w:t>
+      </w:r>
+    </w:p>
+    <w:tbl>
+      <w:tblPr>
+        <w:tblW w:type="dxa" w:w="9360"/>
+        <w:tblLayout w:type="fixed"/>
+        <w:tblLook w:firstColumn="1" w:firstRow="1" w:lastColumn="0" w:lastRow="0" w:noHBand="0" w:noVBand="1" w:val="04A0"/>
+        <w:jc w:val="left"/>
+        <w:tblInd w:w="120" w:type="dxa"/>
+      </w:tblPr>
+      <w:tblGrid>
+        <w:gridCol w:w="3120"/>
+        <w:gridCol w:w="3120"/>
+        <w:gridCol w:w="3120"/>
+      </w:tblGrid>
+      <w:tr>
+        <w:tc>
+          <w:tcPr>
+            <w:tcW w:type="dxa" w:w="3120"/>
+            <w:tcMar>
+              <w:top w:w="80" w:type="dxa"/>
+              <w:start w:w="120" w:type="dxa"/>
+              <w:bottom w:w="80" w:type="dxa"/>
+              <w:end w:w="120" w:type="dxa"/>
+            </w:tcMar>
+            <w:vAlign w:val="center"/>
+            <w:shd w:fill="E8EEF5"/>
+            <w:tcBorders>
+              <w:top w:val="single" w:sz="6" w:color="D7DBE2"/>
+              <w:left w:val="single" w:sz="6" w:color="D7DBE2"/>
+              <w:bottom w:val="single" w:sz="6" w:color="D7DBE2"/>
+              <w:right w:val="single" w:sz="6" w:color="D7DBE2"/>
+            </w:tcBorders>
+          </w:tcPr>
+          <w:p>
+            <w:pPr>
+              <w:keepNext w:val="0"/>
+              <w:spacing w:before="0" w:after="0" w:line="240" w:lineRule="auto"/>
+            </w:pPr>
+            <w:r>
+              <w:rPr>
+                <w:rFonts w:ascii="Calibri" w:hAnsi="Calibri"/>
+                <w:b/>
+                <w:i w:val="0"/>
+                <w:color w:val="1F4D78"/>
+                <w:sz w:val="20"/>
+              </w:rPr>
+              <w:t>OPEN + UNLINKED</w:t>
+            </w:r>
+          </w:p>
+        </w:tc>
+        <w:tc>
+          <w:tcPr>
+            <w:tcW w:type="dxa" w:w="3120"/>
+            <w:tcMar>
+              <w:top w:w="80" w:type="dxa"/>
+              <w:start w:w="120" w:type="dxa"/>
+              <w:bottom w:w="80" w:type="dxa"/>
+              <w:end w:w="120" w:type="dxa"/>
+            </w:tcMar>
+            <w:vAlign w:val="center"/>
+            <w:shd w:fill="E8EEF5"/>
+            <w:tcBorders>
+              <w:top w:val="single" w:sz="6" w:color="D7DBE2"/>
+              <w:left w:val="single" w:sz="6" w:color="D7DBE2"/>
+              <w:bottom w:val="single" w:sz="6" w:color="D7DBE2"/>
+              <w:right w:val="single" w:sz="6" w:color="D7DBE2"/>
+            </w:tcBorders>
+          </w:tcPr>
+          <w:p>
+            <w:pPr>
+              <w:keepNext w:val="0"/>
+              <w:spacing w:before="0" w:after="0" w:line="240" w:lineRule="auto"/>
+            </w:pPr>
+            <w:r>
+              <w:rPr>
+                <w:rFonts w:ascii="Calibri" w:hAnsi="Calibri"/>
+                <w:b/>
+                <w:i w:val="0"/>
+                <w:color w:val="1F4D78"/>
+                <w:sz w:val="20"/>
+              </w:rPr>
+              <w:t>ALREADY PROGRESSED</w:t>
+            </w:r>
+          </w:p>
+        </w:tc>
+        <w:tc>
+          <w:tcPr>
+            <w:tcW w:type="dxa" w:w="3120"/>
+            <w:tcMar>
+              <w:top w:w="80" w:type="dxa"/>
+              <w:start w:w="120" w:type="dxa"/>
+              <w:bottom w:w="80" w:type="dxa"/>
+              <w:end w:w="120" w:type="dxa"/>
+            </w:tcMar>
+            <w:vAlign w:val="center"/>
+            <w:shd w:fill="E8EEF5"/>
+            <w:tcBorders>
+              <w:top w:val="single" w:sz="6" w:color="D7DBE2"/>
+              <w:left w:val="single" w:sz="6" w:color="D7DBE2"/>
+              <w:bottom w:val="single" w:sz="6" w:color="D7DBE2"/>
+              <w:right w:val="single" w:sz="6" w:color="D7DBE2"/>
+            </w:tcBorders>
+          </w:tcPr>
+          <w:p>
+            <w:pPr>
+              <w:keepNext w:val="0"/>
+              <w:spacing w:before="0" w:after="0" w:line="240" w:lineRule="auto"/>
+            </w:pPr>
+            <w:r>
+              <w:rPr>
+                <w:rFonts w:ascii="Calibri" w:hAnsi="Calibri"/>
+                <w:b/>
+                <w:i w:val="0"/>
+                <w:color w:val="1F4D78"/>
+                <w:sz w:val="20"/>
+              </w:rPr>
+              <w:t>IDENTITY NEEDS HELP</w:t>
+            </w:r>
+          </w:p>
+        </w:tc>
+      </w:tr>
+      <w:tr>
+        <w:tc>
+          <w:tcPr>
+            <w:tcW w:type="dxa" w:w="3120"/>
+            <w:tcBorders>
+              <w:top w:val="single" w:sz="6" w:color="D7DBE2"/>
+              <w:left w:val="single" w:sz="6" w:color="D7DBE2"/>
+              <w:bottom w:val="single" w:sz="6" w:color="D7DBE2"/>
+              <w:right w:val="single" w:sz="6" w:color="D7DBE2"/>
+            </w:tcBorders>
+            <w:tcMar>
+              <w:top w:w="80" w:type="dxa"/>
+              <w:start w:w="120" w:type="dxa"/>
+              <w:bottom w:w="80" w:type="dxa"/>
+              <w:end w:w="120" w:type="dxa"/>
+            </w:tcMar>
+            <w:vAlign w:val="center"/>
+          </w:tcPr>
+          <w:p>
+            <w:pPr>
+              <w:keepNext w:val="0"/>
+              <w:spacing w:before="0" w:after="0" w:line="276" w:lineRule="auto"/>
+            </w:pPr>
+            <w:r>
+              <w:rPr>
+                <w:rFonts w:ascii="Calibri" w:hAnsi="Calibri"/>
+                <w:b w:val="0"/>
+                <w:i w:val="0"/>
+                <w:color w:val="20252B"/>
+                <w:sz w:val="20"/>
+              </w:rPr>
+              <w:t>Available to choose</w:t>
+            </w:r>
+          </w:p>
+        </w:tc>
+        <w:tc>
+          <w:tcPr>
+            <w:tcW w:type="dxa" w:w="3120"/>
+            <w:tcBorders>
+              <w:top w:val="single" w:sz="6" w:color="D7DBE2"/>
+              <w:left w:val="single" w:sz="6" w:color="D7DBE2"/>
+              <w:bottom w:val="single" w:sz="6" w:color="D7DBE2"/>
+              <w:right w:val="single" w:sz="6" w:color="D7DBE2"/>
+            </w:tcBorders>
+            <w:tcMar>
+              <w:top w:w="80" w:type="dxa"/>
+              <w:start w:w="120" w:type="dxa"/>
+              <w:bottom w:w="80" w:type="dxa"/>
+              <w:end w:w="120" w:type="dxa"/>
+            </w:tcMar>
+            <w:vAlign w:val="center"/>
+          </w:tcPr>
+          <w:p>
+            <w:pPr>
+              <w:keepNext w:val="0"/>
+              <w:spacing w:before="0" w:after="0" w:line="276" w:lineRule="auto"/>
+            </w:pPr>
+            <w:r>
+              <w:rPr>
+                <w:rFonts w:ascii="Calibri" w:hAnsi="Calibri"/>
+                <w:b/>
+                <w:i w:val="0"/>
+                <w:color w:val="20252B"/>
+                <w:sz w:val="20"/>
+              </w:rPr>
+              <w:t>Retained in report history or its case</w:t>
+            </w:r>
+          </w:p>
+        </w:tc>
+        <w:tc>
+          <w:tcPr>
+            <w:tcW w:type="dxa" w:w="3120"/>
+            <w:tcBorders>
+              <w:top w:val="single" w:sz="6" w:color="D7DBE2"/>
+              <w:left w:val="single" w:sz="6" w:color="D7DBE2"/>
+              <w:bottom w:val="single" w:sz="6" w:color="D7DBE2"/>
+              <w:right w:val="single" w:sz="6" w:color="D7DBE2"/>
+            </w:tcBorders>
+            <w:tcMar>
+              <w:top w:w="80" w:type="dxa"/>
+              <w:start w:w="120" w:type="dxa"/>
+              <w:bottom w:w="80" w:type="dxa"/>
+              <w:end w:w="120" w:type="dxa"/>
+            </w:tcMar>
+            <w:vAlign w:val="center"/>
+          </w:tcPr>
+          <w:p>
+            <w:pPr>
+              <w:keepNext w:val="0"/>
+              <w:spacing w:before="0" w:after="0" w:line="276" w:lineRule="auto"/>
+            </w:pPr>
+            <w:r>
+              <w:rPr>
+                <w:rFonts w:ascii="Calibri" w:hAnsi="Calibri"/>
+                <w:b w:val="0"/>
+                <w:i w:val="0"/>
+                <w:color w:val="20252B"/>
+                <w:sz w:val="20"/>
+              </w:rPr>
+              <w:t>Selection blocks for manual checking</w:t>
+            </w:r>
+          </w:p>
+        </w:tc>
+      </w:tr>
+    </w:tbl>
     <w:p>
       <w:pPr>
         <w:keepNext w:val="0"/>
@@ -3324,7 +3634,7 @@
                 <w:color w:val="20252B"/>
                 <w:sz w:val="22"/>
               </w:rPr>
-              <w:t>Staff tick the exact reports to progress and save the work list.</w:t>
+              <w:t>Staff tick the exact open reports to progress and save the work list.</w:t>
             </w:r>
           </w:p>
         </w:tc>
@@ -3506,7 +3816,7 @@
               </w:rPr>
               <w:t>Hidden from the normal queue</w:t>
               <w:br/>
-              <w:t>Stops here until deliberately reselected</w:t>
+              <w:t>Retained until deliberately reselected</w:t>
             </w:r>
           </w:p>
         </w:tc>
@@ -3843,74 +4153,6 @@
         <w:spacing w:before="0" w:after="0" w:line="240" w:lineRule="auto"/>
       </w:pPr>
     </w:p>
-    <w:p>
-      <w:pPr>
-        <w:pStyle w:val="Heading2"/>
-      </w:pPr>
-      <w:r>
-        <w:t>What this protects</w:t>
-      </w:r>
-    </w:p>
-    <w:p>
-      <w:pPr>
-        <w:keepNext w:val="0"/>
-        <w:spacing w:before="0" w:after="80" w:line="300" w:lineRule="auto"/>
-        <w:numPr>
-          <w:ilvl w:val="0"/>
-          <w:numId w:val="212"/>
-        </w:numPr>
-      </w:pPr>
-      <w:r>
-        <w:rPr>
-          <w:rFonts w:ascii="Calibri" w:hAnsi="Calibri"/>
-          <w:b w:val="0"/>
-          <w:i w:val="0"/>
-          <w:color w:val="20252B"/>
-          <w:sz w:val="22"/>
-        </w:rPr>
-        <w:t>The supplied source remains complete and unchanged.</w:t>
-      </w:r>
-    </w:p>
-    <w:p>
-      <w:pPr>
-        <w:keepNext w:val="0"/>
-        <w:spacing w:before="0" w:after="80" w:line="300" w:lineRule="auto"/>
-        <w:numPr>
-          <w:ilvl w:val="0"/>
-          <w:numId w:val="212"/>
-        </w:numPr>
-      </w:pPr>
-      <w:r>
-        <w:rPr>
-          <w:rFonts w:ascii="Calibri" w:hAnsi="Calibri"/>
-          <w:b w:val="0"/>
-          <w:i w:val="0"/>
-          <w:color w:val="20252B"/>
-          <w:sz w:val="22"/>
-        </w:rPr>
-        <w:t>The active workload is explicit, reversible and auditable.</w:t>
-      </w:r>
-    </w:p>
-    <w:p>
-      <w:pPr>
-        <w:keepNext w:val="0"/>
-        <w:spacing w:before="0" w:after="80" w:line="300" w:lineRule="auto"/>
-        <w:numPr>
-          <w:ilvl w:val="0"/>
-          <w:numId w:val="212"/>
-        </w:numPr>
-      </w:pPr>
-      <w:r>
-        <w:rPr>
-          <w:rFonts w:ascii="Calibri" w:hAnsi="Calibri"/>
-          <w:b w:val="0"/>
-          <w:i w:val="0"/>
-          <w:color w:val="20252B"/>
-          <w:sz w:val="22"/>
-        </w:rPr>
-        <w:t>Selection alone cannot create a case, contact a club or impose an outcome.</w:t>
-      </w:r>
-    </w:p>
     <w:sectPr>
       <w:headerReference w:type="default" r:id="rId9"/>
       <w:footerReference w:type="default" r:id="rId10"/>
@@ -4373,7 +4615,7 @@
     </w:lvlOverride>
   </w:num>
   <w:num w:numId="211">
-    <w:abstractNumId w:val="91"/>
+    <w:abstractNumId w:val="90"/>
     <w:lvlOverride w:ilvl="0">
       <w:startOverride w:val="1"/>
     </w:lvlOverride>

</xml_diff>

<commit_message>
Make ineligible email workflow actionable
</commit_message>
<xml_diff>
--- a/outputs/ineligible-guide/GMCL_Ineligible_Player_Quick_Guide.docx
+++ b/outputs/ineligible-guide/GMCL_Ineligible_Player_Quick_Guide.docx
@@ -3043,7 +3043,89 @@
         <w:pStyle w:val="Heading1"/>
       </w:pPr>
       <w:r>
-        <w:t>After a live case is raised</w:t>
+        <w:t>Send the first email after raising a case</w:t>
+      </w:r>
+    </w:p>
+    <w:tbl>
+      <w:tblPr>
+        <w:tblW w:type="dxa" w:w="9360"/>
+        <w:jc w:val="left"/>
+        <w:tblLayout w:type="fixed"/>
+        <w:tblLook w:firstColumn="1" w:firstRow="1" w:lastColumn="0" w:lastRow="0" w:noHBand="0" w:noVBand="1" w:val="04A0"/>
+        <w:tblInd w:w="120" w:type="dxa"/>
+      </w:tblPr>
+      <w:tblGrid>
+        <w:gridCol w:w="9360"/>
+      </w:tblGrid>
+      <w:tr>
+        <w:tc>
+          <w:tcPr>
+            <w:tcW w:type="dxa" w:w="9360"/>
+            <w:tcMar>
+              <w:top w:w="80" w:type="dxa"/>
+              <w:start w:w="120" w:type="dxa"/>
+              <w:bottom w:w="80" w:type="dxa"/>
+              <w:end w:w="120" w:type="dxa"/>
+            </w:tcMar>
+            <w:vAlign w:val="center"/>
+            <w:shd w:fill="E8EEF5"/>
+            <w:tcBorders>
+              <w:left w:val="single" w:sz="18" w:color="2E74B5"/>
+            </w:tcBorders>
+          </w:tcPr>
+          <w:p>
+            <w:pPr>
+              <w:keepNext w:val="0"/>
+              <w:spacing w:before="0" w:after="0" w:line="300" w:lineRule="auto"/>
+            </w:pPr>
+            <w:r>
+              <w:rPr>
+                <w:rFonts w:ascii="Calibri" w:hAnsi="Calibri"/>
+                <w:b/>
+                <w:i w:val="0"/>
+                <w:color w:val="2E74B5"/>
+                <w:sz w:val="18"/>
+              </w:rPr>
+              <w:t xml:space="preserve">WHERE TO START  </w:t>
+            </w:r>
+            <w:r>
+              <w:rPr>
+                <w:rFonts w:ascii="Calibri" w:hAnsi="Calibri"/>
+                <w:b w:val="0"/>
+                <w:i w:val="0"/>
+                <w:color w:val="20252B"/>
+                <w:sz w:val="22"/>
+              </w:rPr>
+              <w:t>Use the large Next action: contact the club for its explanation section. Work down the three numbered cards in order.</w:t>
+            </w:r>
+          </w:p>
+        </w:tc>
+      </w:tr>
+    </w:tbl>
+    <w:p>
+      <w:pPr>
+        <w:keepNext w:val="0"/>
+        <w:spacing w:before="0" w:after="0" w:line="240" w:lineRule="auto"/>
+      </w:pPr>
+    </w:p>
+    <w:p>
+      <w:pPr>
+        <w:keepNext w:val="0"/>
+        <w:spacing w:before="0" w:after="80" w:line="300" w:lineRule="auto"/>
+        <w:numPr>
+          <w:ilvl w:val="0"/>
+          <w:numId w:val="211"/>
+        </w:numPr>
+      </w:pPr>
+      <w:r>
+        <w:rPr>
+          <w:rFonts w:ascii="Calibri" w:hAnsi="Calibri"/>
+          <w:b w:val="0"/>
+          <w:i w:val="0"/>
+          <w:color w:val="20252B"/>
+          <w:sz w:val="22"/>
+        </w:rPr>
+        <w:t>If prompted, record and save the alleged rule under investigation.</w:t>
       </w:r>
     </w:p>
     <w:p>
@@ -3063,7 +3145,7 @@
           <w:color w:val="20252B"/>
           <w:sz w:val="22"/>
         </w:rPr>
-        <w:t>Open the case and check the evidence and published rule.</w:t>
+        <w:t>Review the initial email, then select Save initial email. Saving does not contact the club.</w:t>
       </w:r>
     </w:p>
     <w:p>
@@ -3083,7 +3165,7 @@
           <w:color w:val="20252B"/>
           <w:sz w:val="22"/>
         </w:rPr>
-        <w:t>Save the initial email and reminder, then send the initial email when ready.</w:t>
+        <w:t>Optional: tick the safe-test confirmation and select Send TEST copy to me. It goes only to your administrator email, has no live response link and does not change the case.</w:t>
       </w:r>
     </w:p>
     <w:p>
@@ -3103,7 +3185,7 @@
           <w:color w:val="20252B"/>
           <w:sz w:val="22"/>
         </w:rPr>
-        <w:t>Review the club response and any new evidence.</w:t>
+        <w:t>Review the reminder, then select Save reminder. It is prepared now but is not sent now.</w:t>
       </w:r>
     </w:p>
     <w:p>
@@ -3123,7 +3205,7 @@
           <w:color w:val="20252B"/>
           <w:sz w:val="22"/>
         </w:rPr>
-        <w:t>Prepare the decision and submit it for approval.</w:t>
+        <w:t>Check the displayed To address, then select Send initial email to club only when you intend to contact the club.</w:t>
       </w:r>
     </w:p>
     <w:p>
@@ -3143,27 +3225,7 @@
           <w:color w:val="20252B"/>
           <w:sz w:val="22"/>
         </w:rPr>
-        <w:t>A different authorised administrator checks and approves it.</w:t>
-      </w:r>
-    </w:p>
-    <w:p>
-      <w:pPr>
-        <w:keepNext w:val="0"/>
-        <w:spacing w:before="0" w:after="80" w:line="300" w:lineRule="auto"/>
-        <w:numPr>
-          <w:ilvl w:val="0"/>
-          <w:numId w:val="211"/>
-        </w:numPr>
-      </w:pPr>
-      <w:r>
-        <w:rPr>
-          <w:rFonts w:ascii="Calibri" w:hAnsi="Calibri"/>
-          <w:b w:val="0"/>
-          <w:i w:val="0"/>
-          <w:color w:val="20252B"/>
-          <w:sz w:val="22"/>
-        </w:rPr>
-        <w:t>After final previews, issue the approved outcomes.</w:t>
+        <w:t>Check delivery history. The seven-day period starts after delivery; the reminder is sent on day five only if still needed.</w:t>
       </w:r>
     </w:p>
     <w:p>
@@ -3171,7 +3233,7 @@
         <w:pStyle w:val="Heading2"/>
       </w:pPr>
       <w:r>
-        <w:t>Three safety checks</w:t>
+        <w:t>Assign the case or ask for help</w:t>
       </w:r>
     </w:p>
     <w:p>
@@ -3191,7 +3253,7 @@
           <w:color w:val="20252B"/>
           <w:sz w:val="22"/>
         </w:rPr>
-        <w:t>Raising a case does not send an email.</w:t>
+        <w:t>Under Case owner and help, choose an administrator, enter the reason and select Save case owner to hand over the whole investigation.</w:t>
       </w:r>
     </w:p>
     <w:p>
@@ -3211,6 +3273,114 @@
           <w:color w:val="20252B"/>
           <w:sz w:val="22"/>
         </w:rPr>
+        <w:t>To keep ownership, choose another administrator under Give a supporting task, describe the work, add an optional due date and select Assign supporting task.</w:t>
+      </w:r>
+    </w:p>
+    <w:p>
+      <w:pPr>
+        <w:keepNext w:val="0"/>
+        <w:spacing w:before="0" w:after="80" w:line="300" w:lineRule="auto"/>
+        <w:numPr>
+          <w:ilvl w:val="0"/>
+          <w:numId w:val="212"/>
+        </w:numPr>
+      </w:pPr>
+      <w:r>
+        <w:rPr>
+          <w:rFonts w:ascii="Calibri" w:hAnsi="Calibri"/>
+          <w:b w:val="0"/>
+          <w:i w:val="0"/>
+          <w:color w:val="20252B"/>
+          <w:sz w:val="22"/>
+        </w:rPr>
+        <w:t>Open supporting tasks remain visible on the case and in the task list. Every change is audited.</w:t>
+      </w:r>
+    </w:p>
+    <w:p>
+      <w:pPr>
+        <w:pStyle w:val="Heading2"/>
+      </w:pPr>
+      <w:r>
+        <w:t>Safety checks</w:t>
+      </w:r>
+    </w:p>
+    <w:p>
+      <w:pPr>
+        <w:keepNext w:val="0"/>
+        <w:spacing w:before="0" w:after="80" w:line="300" w:lineRule="auto"/>
+        <w:numPr>
+          <w:ilvl w:val="0"/>
+          <w:numId w:val="213"/>
+        </w:numPr>
+      </w:pPr>
+      <w:r>
+        <w:rPr>
+          <w:rFonts w:ascii="Calibri" w:hAnsi="Calibri"/>
+          <w:b w:val="0"/>
+          <w:i w:val="0"/>
+          <w:color w:val="20252B"/>
+          <w:sz w:val="22"/>
+        </w:rPr>
+        <w:t>Raising a case does not send an email.</w:t>
+      </w:r>
+    </w:p>
+    <w:p>
+      <w:pPr>
+        <w:keepNext w:val="0"/>
+        <w:spacing w:before="0" w:after="80" w:line="300" w:lineRule="auto"/>
+        <w:numPr>
+          <w:ilvl w:val="0"/>
+          <w:numId w:val="213"/>
+        </w:numPr>
+      </w:pPr>
+      <w:r>
+        <w:rPr>
+          <w:rFonts w:ascii="Calibri" w:hAnsi="Calibri"/>
+          <w:b w:val="0"/>
+          <w:i w:val="0"/>
+          <w:color w:val="20252B"/>
+          <w:sz w:val="22"/>
+        </w:rPr>
+        <w:t>Saving either draft does not send an email. A TEST copy goes only to your administrator address and cannot open a club response window.</w:t>
+      </w:r>
+    </w:p>
+    <w:p>
+      <w:pPr>
+        <w:keepNext w:val="0"/>
+        <w:spacing w:before="0" w:after="80" w:line="300" w:lineRule="auto"/>
+        <w:numPr>
+          <w:ilvl w:val="0"/>
+          <w:numId w:val="213"/>
+        </w:numPr>
+      </w:pPr>
+      <w:r>
+        <w:rPr>
+          <w:rFonts w:ascii="Calibri" w:hAnsi="Calibri"/>
+          <w:b w:val="0"/>
+          <w:i w:val="0"/>
+          <w:color w:val="20252B"/>
+          <w:sz w:val="22"/>
+        </w:rPr>
+        <w:t>Send initial email to club is the deliberate live-send action.</w:t>
+      </w:r>
+    </w:p>
+    <w:p>
+      <w:pPr>
+        <w:keepNext w:val="0"/>
+        <w:spacing w:before="0" w:after="80" w:line="300" w:lineRule="auto"/>
+        <w:numPr>
+          <w:ilvl w:val="0"/>
+          <w:numId w:val="213"/>
+        </w:numPr>
+      </w:pPr>
+      <w:r>
+        <w:rPr>
+          <w:rFonts w:ascii="Calibri" w:hAnsi="Calibri"/>
+          <w:b w:val="0"/>
+          <w:i w:val="0"/>
+          <w:color w:val="20252B"/>
+          <w:sz w:val="22"/>
+        </w:rPr>
         <w:t>A decision requires approval by a different authorised administrator.</w:t>
       </w:r>
     </w:p>
@@ -3220,7 +3390,7 @@
         <w:spacing w:before="0" w:after="80" w:line="300" w:lineRule="auto"/>
         <w:numPr>
           <w:ilvl w:val="0"/>
-          <w:numId w:val="212"/>
+          <w:numId w:val="213"/>
         </w:numPr>
       </w:pPr>
       <w:r>
@@ -4626,6 +4796,12 @@
       <w:startOverride w:val="1"/>
     </w:lvlOverride>
   </w:num>
+  <w:num w:numId="213">
+    <w:abstractNumId w:val="91"/>
+    <w:lvlOverride w:ilvl="0">
+      <w:startOverride w:val="1"/>
+    </w:lvlOverride>
+  </w:num>
 </w:numbering>
 </file>
 

</xml_diff>